<commit_message>
add last meeting minutes
</commit_message>
<xml_diff>
--- a/meeting_minutes/Meeting Minutes.docx
+++ b/meeting_minutes/Meeting Minutes.docx
@@ -214,23 +214,29 @@
                 <w:szCs w:val="24"/>
               </w:rPr>
             </w:pPr>
-            <w:proofErr w:type="spellStart"/>
-            <w:r>
-              <w:rPr>
-                <w:rFonts w:ascii="Times New Roman" w:eastAsia="Times New Roman" w:hAnsi="Times New Roman" w:cs="Times New Roman"/>
-                <w:sz w:val="24"/>
-                <w:szCs w:val="24"/>
-              </w:rPr>
-              <w:t>Aryman</w:t>
-            </w:r>
-            <w:proofErr w:type="spellEnd"/>
-            <w:r>
-              <w:rPr>
-                <w:rFonts w:ascii="Times New Roman" w:eastAsia="Times New Roman" w:hAnsi="Times New Roman" w:cs="Times New Roman"/>
-                <w:sz w:val="24"/>
-                <w:szCs w:val="24"/>
-              </w:rPr>
-              <w:t xml:space="preserve"> A. (he had an interview and was present on discord to chat after he finished his interview). </w:t>
+            <w:r>
+              <w:rPr>
+                <w:rFonts w:ascii="Times New Roman" w:eastAsia="Times New Roman" w:hAnsi="Times New Roman" w:cs="Times New Roman"/>
+                <w:sz w:val="24"/>
+                <w:szCs w:val="24"/>
+              </w:rPr>
+              <w:t>Ary</w:t>
+            </w:r>
+            <w:r>
+              <w:rPr>
+                <w:rFonts w:ascii="Times New Roman" w:eastAsia="Times New Roman" w:hAnsi="Times New Roman" w:cs="Times New Roman"/>
+                <w:sz w:val="24"/>
+                <w:szCs w:val="24"/>
+              </w:rPr>
+              <w:t>a</w:t>
+            </w:r>
+            <w:r>
+              <w:rPr>
+                <w:rFonts w:ascii="Times New Roman" w:eastAsia="Times New Roman" w:hAnsi="Times New Roman" w:cs="Times New Roman"/>
+                <w:sz w:val="24"/>
+                <w:szCs w:val="24"/>
+              </w:rPr>
+              <w:t xml:space="preserve">man A. (he had an interview and was present on discord to chat after he finished his interview). </w:t>
             </w:r>
           </w:p>
         </w:tc>
@@ -6066,7 +6072,15 @@
                 <w:sz w:val="24"/>
                 <w:szCs w:val="24"/>
               </w:rPr>
-              <w:t>Nov 28</w:t>
+              <w:t xml:space="preserve">Nov </w:t>
+            </w:r>
+            <w:r>
+              <w:rPr>
+                <w:rFonts w:ascii="Times New Roman" w:eastAsia="Times New Roman" w:hAnsi="Times New Roman" w:cs="Times New Roman"/>
+                <w:sz w:val="24"/>
+                <w:szCs w:val="24"/>
+              </w:rPr>
+              <w:t>30</w:t>
             </w:r>
           </w:p>
         </w:tc>
@@ -6119,7 +6133,7 @@
                 <w:sz w:val="24"/>
                 <w:szCs w:val="24"/>
               </w:rPr>
-              <w:t>ALL</w:t>
+              <w:t xml:space="preserve">Sachi S. and Aryaman D. </w:t>
             </w:r>
             <w:r>
               <w:rPr>
@@ -6230,9 +6244,227 @@
               <w:rPr>
                 <w:color w:val="000000"/>
               </w:rPr>
-              <w:t>Delegated remaining tasks for the project submission along with finalizing the issues and features that we wanted to implement for the last demo. </w:t>
-            </w:r>
-          </w:p>
+              <w:t>Called to discuss allocation of user guide and requirements completion.</w:t>
+            </w:r>
+            <w:r>
+              <w:rPr>
+                <w:color w:val="000000"/>
+              </w:rPr>
+              <w:t xml:space="preserve"> </w:t>
+            </w:r>
+          </w:p>
+        </w:tc>
+      </w:tr>
+    </w:tbl>
+    <w:p>
+      <w:pPr>
+        <w:rPr>
+          <w:rFonts w:ascii="Times New Roman" w:eastAsia="Times New Roman" w:hAnsi="Times New Roman" w:cs="Times New Roman"/>
+          <w:b/>
+          <w:bCs/>
+          <w:sz w:val="24"/>
+          <w:szCs w:val="24"/>
+        </w:rPr>
+      </w:pPr>
+    </w:p>
+    <w:tbl>
+      <w:tblPr>
+        <w:tblStyle w:val="TableGrid"/>
+        <w:tblW w:w="0" w:type="auto"/>
+        <w:tblLayout w:type="fixed"/>
+        <w:tblLook w:val="06A0" w:firstRow="1" w:lastRow="0" w:firstColumn="1" w:lastColumn="0" w:noHBand="1" w:noVBand="1"/>
+      </w:tblPr>
+      <w:tblGrid>
+        <w:gridCol w:w="1860"/>
+        <w:gridCol w:w="8940"/>
+      </w:tblGrid>
+      <w:tr>
+        <w:trPr>
+          <w:trHeight w:val="300"/>
+        </w:trPr>
+        <w:tc>
+          <w:tcPr>
+            <w:tcW w:w="1860" w:type="dxa"/>
+          </w:tcPr>
+          <w:p>
+            <w:pPr>
+              <w:rPr>
+                <w:rFonts w:ascii="Times New Roman" w:eastAsia="Times New Roman" w:hAnsi="Times New Roman" w:cs="Times New Roman"/>
+                <w:b/>
+                <w:bCs/>
+                <w:sz w:val="24"/>
+                <w:szCs w:val="24"/>
+              </w:rPr>
+            </w:pPr>
+            <w:r>
+              <w:rPr>
+                <w:rFonts w:ascii="Times New Roman" w:eastAsia="Times New Roman" w:hAnsi="Times New Roman" w:cs="Times New Roman"/>
+                <w:b/>
+                <w:bCs/>
+                <w:sz w:val="24"/>
+                <w:szCs w:val="24"/>
+              </w:rPr>
+              <w:t>DATE</w:t>
+            </w:r>
+          </w:p>
+        </w:tc>
+        <w:tc>
+          <w:tcPr>
+            <w:tcW w:w="8940" w:type="dxa"/>
+          </w:tcPr>
+          <w:p>
+            <w:pPr>
+              <w:rPr>
+                <w:rFonts w:ascii="Times New Roman" w:eastAsia="Times New Roman" w:hAnsi="Times New Roman" w:cs="Times New Roman"/>
+                <w:sz w:val="24"/>
+                <w:szCs w:val="24"/>
+              </w:rPr>
+            </w:pPr>
+            <w:r>
+              <w:rPr>
+                <w:rFonts w:ascii="Times New Roman" w:eastAsia="Times New Roman" w:hAnsi="Times New Roman" w:cs="Times New Roman"/>
+                <w:sz w:val="24"/>
+                <w:szCs w:val="24"/>
+              </w:rPr>
+              <w:t>Dec 4</w:t>
+            </w:r>
+          </w:p>
+        </w:tc>
+      </w:tr>
+      <w:tr>
+        <w:trPr>
+          <w:trHeight w:val="300"/>
+        </w:trPr>
+        <w:tc>
+          <w:tcPr>
+            <w:tcW w:w="1860" w:type="dxa"/>
+          </w:tcPr>
+          <w:p>
+            <w:pPr>
+              <w:rPr>
+                <w:rFonts w:ascii="Times New Roman" w:eastAsia="Times New Roman" w:hAnsi="Times New Roman" w:cs="Times New Roman"/>
+                <w:b/>
+                <w:bCs/>
+                <w:sz w:val="24"/>
+                <w:szCs w:val="24"/>
+              </w:rPr>
+            </w:pPr>
+            <w:r>
+              <w:rPr>
+                <w:rFonts w:ascii="Times New Roman" w:eastAsia="Times New Roman" w:hAnsi="Times New Roman" w:cs="Times New Roman"/>
+                <w:b/>
+                <w:bCs/>
+                <w:sz w:val="24"/>
+                <w:szCs w:val="24"/>
+              </w:rPr>
+              <w:t>PRESENT</w:t>
+            </w:r>
+          </w:p>
+        </w:tc>
+        <w:tc>
+          <w:tcPr>
+            <w:tcW w:w="8940" w:type="dxa"/>
+          </w:tcPr>
+          <w:p>
+            <w:pPr>
+              <w:rPr>
+                <w:rFonts w:ascii="Times New Roman" w:eastAsia="Times New Roman" w:hAnsi="Times New Roman" w:cs="Times New Roman"/>
+                <w:sz w:val="24"/>
+                <w:szCs w:val="24"/>
+              </w:rPr>
+            </w:pPr>
+            <w:r>
+              <w:rPr>
+                <w:rFonts w:ascii="Times New Roman" w:eastAsia="Times New Roman" w:hAnsi="Times New Roman" w:cs="Times New Roman"/>
+                <w:sz w:val="24"/>
+                <w:szCs w:val="24"/>
+              </w:rPr>
+              <w:t xml:space="preserve">Cedric W. and Aryaman A. </w:t>
+            </w:r>
+          </w:p>
+        </w:tc>
+      </w:tr>
+      <w:tr>
+        <w:trPr>
+          <w:trHeight w:val="300"/>
+        </w:trPr>
+        <w:tc>
+          <w:tcPr>
+            <w:tcW w:w="1860" w:type="dxa"/>
+          </w:tcPr>
+          <w:p>
+            <w:pPr>
+              <w:rPr>
+                <w:rFonts w:ascii="Times New Roman" w:eastAsia="Times New Roman" w:hAnsi="Times New Roman" w:cs="Times New Roman"/>
+                <w:b/>
+                <w:bCs/>
+                <w:sz w:val="24"/>
+                <w:szCs w:val="24"/>
+              </w:rPr>
+            </w:pPr>
+            <w:r>
+              <w:rPr>
+                <w:rFonts w:ascii="Times New Roman" w:eastAsia="Times New Roman" w:hAnsi="Times New Roman" w:cs="Times New Roman"/>
+                <w:b/>
+                <w:bCs/>
+                <w:sz w:val="24"/>
+                <w:szCs w:val="24"/>
+              </w:rPr>
+              <w:t>ABSENT</w:t>
+            </w:r>
+          </w:p>
+        </w:tc>
+        <w:tc>
+          <w:tcPr>
+            <w:tcW w:w="8940" w:type="dxa"/>
+          </w:tcPr>
+          <w:p>
+            <w:pPr>
+              <w:rPr>
+                <w:rFonts w:ascii="Times New Roman" w:eastAsia="Times New Roman" w:hAnsi="Times New Roman" w:cs="Times New Roman"/>
+                <w:b/>
+                <w:bCs/>
+                <w:sz w:val="24"/>
+                <w:szCs w:val="24"/>
+              </w:rPr>
+            </w:pPr>
+          </w:p>
+        </w:tc>
+      </w:tr>
+      <w:tr>
+        <w:trPr>
+          <w:trHeight w:val="201"/>
+        </w:trPr>
+        <w:tc>
+          <w:tcPr>
+            <w:tcW w:w="1860" w:type="dxa"/>
+          </w:tcPr>
+          <w:p>
+            <w:pPr>
+              <w:rPr>
+                <w:rFonts w:ascii="Times New Roman" w:eastAsia="Times New Roman" w:hAnsi="Times New Roman" w:cs="Times New Roman"/>
+                <w:b/>
+                <w:bCs/>
+                <w:sz w:val="24"/>
+                <w:szCs w:val="24"/>
+              </w:rPr>
+            </w:pPr>
+            <w:r>
+              <w:rPr>
+                <w:rFonts w:ascii="Times New Roman" w:eastAsia="Times New Roman" w:hAnsi="Times New Roman" w:cs="Times New Roman"/>
+                <w:b/>
+                <w:bCs/>
+                <w:sz w:val="24"/>
+                <w:szCs w:val="24"/>
+              </w:rPr>
+              <w:t>DISCUSSION/ACTION</w:t>
+            </w:r>
+          </w:p>
+        </w:tc>
+        <w:tc>
+          <w:tcPr>
+            <w:tcW w:w="8940" w:type="dxa"/>
+          </w:tcPr>
           <w:p>
             <w:pPr>
               <w:pStyle w:val="NormalWeb"/>
@@ -6243,6 +6475,46 @@
               <w:spacing w:before="0" w:beforeAutospacing="0" w:after="0" w:afterAutospacing="0"/>
               <w:textAlignment w:val="baseline"/>
               <w:rPr>
+                <w:color w:val="000000"/>
+              </w:rPr>
+            </w:pPr>
+            <w:r>
+              <w:rPr>
+                <w:color w:val="000000"/>
+              </w:rPr>
+              <w:t xml:space="preserve">Met to discuss the architecture and testing of the database for the final submission. </w:t>
+            </w:r>
+          </w:p>
+          <w:p>
+            <w:pPr>
+              <w:pStyle w:val="NormalWeb"/>
+              <w:numPr>
+                <w:ilvl w:val="0"/>
+                <w:numId w:val="5"/>
+              </w:numPr>
+              <w:spacing w:before="0" w:beforeAutospacing="0" w:after="0" w:afterAutospacing="0"/>
+              <w:textAlignment w:val="baseline"/>
+              <w:rPr>
+                <w:color w:val="000000"/>
+              </w:rPr>
+            </w:pPr>
+            <w:r>
+              <w:rPr>
+                <w:color w:val="000000"/>
+              </w:rPr>
+              <w:t xml:space="preserve">Divided up the work for architecture by Aryaman working on the Design specific development diagram and explanation and Cedric working on layered architecture and model relationship. </w:t>
+            </w:r>
+          </w:p>
+          <w:p>
+            <w:pPr>
+              <w:pStyle w:val="NormalWeb"/>
+              <w:numPr>
+                <w:ilvl w:val="0"/>
+                <w:numId w:val="5"/>
+              </w:numPr>
+              <w:spacing w:before="0" w:beforeAutospacing="0" w:after="0" w:afterAutospacing="0"/>
+              <w:textAlignment w:val="baseline"/>
+              <w:rPr>
                 <w:rFonts w:ascii="Arial" w:hAnsi="Arial" w:cs="Arial"/>
                 <w:color w:val="000000"/>
                 <w:sz w:val="22"/>
@@ -6253,16 +6525,7 @@
               <w:rPr>
                 <w:color w:val="000000"/>
               </w:rPr>
-              <w:t>Talked about bugs and other problems in the application that need to be fixed.</w:t>
-            </w:r>
-            <w:r>
-              <w:rPr>
-                <w:rFonts w:ascii="Arial" w:hAnsi="Arial" w:cs="Arial"/>
-                <w:color w:val="000000"/>
-                <w:sz w:val="22"/>
-                <w:szCs w:val="22"/>
-              </w:rPr>
-              <w:t xml:space="preserve"> </w:t>
+              <w:t>Also divided test cases to check all the server routes within our application.</w:t>
             </w:r>
           </w:p>
         </w:tc>
@@ -6278,6 +6541,290 @@
           <w:szCs w:val="24"/>
         </w:rPr>
       </w:pPr>
+    </w:p>
+    <w:tbl>
+      <w:tblPr>
+        <w:tblStyle w:val="TableGrid"/>
+        <w:tblW w:w="0" w:type="auto"/>
+        <w:tblLayout w:type="fixed"/>
+        <w:tblLook w:val="06A0" w:firstRow="1" w:lastRow="0" w:firstColumn="1" w:lastColumn="0" w:noHBand="1" w:noVBand="1"/>
+      </w:tblPr>
+      <w:tblGrid>
+        <w:gridCol w:w="1860"/>
+        <w:gridCol w:w="8940"/>
+      </w:tblGrid>
+      <w:tr>
+        <w:trPr>
+          <w:trHeight w:val="300"/>
+        </w:trPr>
+        <w:tc>
+          <w:tcPr>
+            <w:tcW w:w="1860" w:type="dxa"/>
+          </w:tcPr>
+          <w:p>
+            <w:pPr>
+              <w:rPr>
+                <w:rFonts w:ascii="Times New Roman" w:eastAsia="Times New Roman" w:hAnsi="Times New Roman" w:cs="Times New Roman"/>
+                <w:b/>
+                <w:bCs/>
+                <w:sz w:val="24"/>
+                <w:szCs w:val="24"/>
+              </w:rPr>
+            </w:pPr>
+            <w:r>
+              <w:rPr>
+                <w:rFonts w:ascii="Times New Roman" w:eastAsia="Times New Roman" w:hAnsi="Times New Roman" w:cs="Times New Roman"/>
+                <w:b/>
+                <w:bCs/>
+                <w:sz w:val="24"/>
+                <w:szCs w:val="24"/>
+              </w:rPr>
+              <w:t>DATE</w:t>
+            </w:r>
+          </w:p>
+        </w:tc>
+        <w:tc>
+          <w:tcPr>
+            <w:tcW w:w="8940" w:type="dxa"/>
+          </w:tcPr>
+          <w:p>
+            <w:pPr>
+              <w:rPr>
+                <w:rFonts w:ascii="Times New Roman" w:eastAsia="Times New Roman" w:hAnsi="Times New Roman" w:cs="Times New Roman"/>
+                <w:sz w:val="24"/>
+                <w:szCs w:val="24"/>
+              </w:rPr>
+            </w:pPr>
+            <w:r>
+              <w:rPr>
+                <w:rFonts w:ascii="Times New Roman" w:eastAsia="Times New Roman" w:hAnsi="Times New Roman" w:cs="Times New Roman"/>
+                <w:sz w:val="24"/>
+                <w:szCs w:val="24"/>
+              </w:rPr>
+              <w:t>Dec</w:t>
+            </w:r>
+            <w:r>
+              <w:rPr>
+                <w:rFonts w:ascii="Times New Roman" w:eastAsia="Times New Roman" w:hAnsi="Times New Roman" w:cs="Times New Roman"/>
+                <w:sz w:val="24"/>
+                <w:szCs w:val="24"/>
+              </w:rPr>
+              <w:t xml:space="preserve"> </w:t>
+            </w:r>
+            <w:r>
+              <w:rPr>
+                <w:rFonts w:ascii="Times New Roman" w:eastAsia="Times New Roman" w:hAnsi="Times New Roman" w:cs="Times New Roman"/>
+                <w:sz w:val="24"/>
+                <w:szCs w:val="24"/>
+              </w:rPr>
+              <w:t>4</w:t>
+            </w:r>
+          </w:p>
+        </w:tc>
+      </w:tr>
+      <w:tr>
+        <w:trPr>
+          <w:trHeight w:val="300"/>
+        </w:trPr>
+        <w:tc>
+          <w:tcPr>
+            <w:tcW w:w="1860" w:type="dxa"/>
+          </w:tcPr>
+          <w:p>
+            <w:pPr>
+              <w:rPr>
+                <w:rFonts w:ascii="Times New Roman" w:eastAsia="Times New Roman" w:hAnsi="Times New Roman" w:cs="Times New Roman"/>
+                <w:b/>
+                <w:bCs/>
+                <w:sz w:val="24"/>
+                <w:szCs w:val="24"/>
+              </w:rPr>
+            </w:pPr>
+            <w:r>
+              <w:rPr>
+                <w:rFonts w:ascii="Times New Roman" w:eastAsia="Times New Roman" w:hAnsi="Times New Roman" w:cs="Times New Roman"/>
+                <w:b/>
+                <w:bCs/>
+                <w:sz w:val="24"/>
+                <w:szCs w:val="24"/>
+              </w:rPr>
+              <w:t>PRESENT</w:t>
+            </w:r>
+          </w:p>
+        </w:tc>
+        <w:tc>
+          <w:tcPr>
+            <w:tcW w:w="8940" w:type="dxa"/>
+          </w:tcPr>
+          <w:p>
+            <w:pPr>
+              <w:rPr>
+                <w:rFonts w:ascii="Times New Roman" w:eastAsia="Times New Roman" w:hAnsi="Times New Roman" w:cs="Times New Roman"/>
+                <w:sz w:val="24"/>
+                <w:szCs w:val="24"/>
+              </w:rPr>
+            </w:pPr>
+            <w:r>
+              <w:rPr>
+                <w:rFonts w:ascii="Times New Roman" w:eastAsia="Times New Roman" w:hAnsi="Times New Roman" w:cs="Times New Roman"/>
+                <w:sz w:val="24"/>
+                <w:szCs w:val="24"/>
+              </w:rPr>
+              <w:t>ALL</w:t>
+            </w:r>
+          </w:p>
+        </w:tc>
+      </w:tr>
+      <w:tr>
+        <w:trPr>
+          <w:trHeight w:val="300"/>
+        </w:trPr>
+        <w:tc>
+          <w:tcPr>
+            <w:tcW w:w="1860" w:type="dxa"/>
+          </w:tcPr>
+          <w:p>
+            <w:pPr>
+              <w:rPr>
+                <w:rFonts w:ascii="Times New Roman" w:eastAsia="Times New Roman" w:hAnsi="Times New Roman" w:cs="Times New Roman"/>
+                <w:b/>
+                <w:bCs/>
+                <w:sz w:val="24"/>
+                <w:szCs w:val="24"/>
+              </w:rPr>
+            </w:pPr>
+            <w:r>
+              <w:rPr>
+                <w:rFonts w:ascii="Times New Roman" w:eastAsia="Times New Roman" w:hAnsi="Times New Roman" w:cs="Times New Roman"/>
+                <w:b/>
+                <w:bCs/>
+                <w:sz w:val="24"/>
+                <w:szCs w:val="24"/>
+              </w:rPr>
+              <w:t>ABSENT</w:t>
+            </w:r>
+          </w:p>
+        </w:tc>
+        <w:tc>
+          <w:tcPr>
+            <w:tcW w:w="8940" w:type="dxa"/>
+          </w:tcPr>
+          <w:p>
+            <w:pPr>
+              <w:rPr>
+                <w:rFonts w:ascii="Times New Roman" w:eastAsia="Times New Roman" w:hAnsi="Times New Roman" w:cs="Times New Roman"/>
+                <w:b/>
+                <w:bCs/>
+                <w:sz w:val="24"/>
+                <w:szCs w:val="24"/>
+              </w:rPr>
+            </w:pPr>
+          </w:p>
+        </w:tc>
+      </w:tr>
+      <w:tr>
+        <w:trPr>
+          <w:trHeight w:val="201"/>
+        </w:trPr>
+        <w:tc>
+          <w:tcPr>
+            <w:tcW w:w="1860" w:type="dxa"/>
+          </w:tcPr>
+          <w:p>
+            <w:pPr>
+              <w:rPr>
+                <w:rFonts w:ascii="Times New Roman" w:eastAsia="Times New Roman" w:hAnsi="Times New Roman" w:cs="Times New Roman"/>
+                <w:b/>
+                <w:bCs/>
+                <w:sz w:val="24"/>
+                <w:szCs w:val="24"/>
+              </w:rPr>
+            </w:pPr>
+            <w:r>
+              <w:rPr>
+                <w:rFonts w:ascii="Times New Roman" w:eastAsia="Times New Roman" w:hAnsi="Times New Roman" w:cs="Times New Roman"/>
+                <w:b/>
+                <w:bCs/>
+                <w:sz w:val="24"/>
+                <w:szCs w:val="24"/>
+              </w:rPr>
+              <w:t>DISCUSSION/ACTION</w:t>
+            </w:r>
+          </w:p>
+        </w:tc>
+        <w:tc>
+          <w:tcPr>
+            <w:tcW w:w="8940" w:type="dxa"/>
+          </w:tcPr>
+          <w:p>
+            <w:pPr>
+              <w:pStyle w:val="NormalWeb"/>
+              <w:numPr>
+                <w:ilvl w:val="0"/>
+                <w:numId w:val="5"/>
+              </w:numPr>
+              <w:spacing w:before="0" w:beforeAutospacing="0" w:after="0" w:afterAutospacing="0"/>
+              <w:textAlignment w:val="baseline"/>
+              <w:rPr>
+                <w:rFonts w:ascii="Arial" w:hAnsi="Arial" w:cs="Arial"/>
+                <w:color w:val="000000"/>
+                <w:sz w:val="22"/>
+                <w:szCs w:val="22"/>
+              </w:rPr>
+            </w:pPr>
+            <w:r>
+              <w:rPr>
+                <w:color w:val="000000"/>
+              </w:rPr>
+              <w:t xml:space="preserve"> </w:t>
+            </w:r>
+            <w:r>
+              <w:rPr>
+                <w:color w:val="000000"/>
+              </w:rPr>
+              <w:t xml:space="preserve">Discussed final things to wrap up. </w:t>
+            </w:r>
+          </w:p>
+        </w:tc>
+      </w:tr>
+    </w:tbl>
+    <w:p>
+      <w:pPr>
+        <w:rPr>
+          <w:rFonts w:ascii="Times New Roman" w:eastAsia="Times New Roman" w:hAnsi="Times New Roman" w:cs="Times New Roman"/>
+          <w:b/>
+          <w:bCs/>
+          <w:sz w:val="24"/>
+          <w:szCs w:val="24"/>
+        </w:rPr>
+      </w:pPr>
+    </w:p>
+    <w:p>
+      <w:pPr>
+        <w:rPr>
+          <w:rFonts w:ascii="Times New Roman" w:eastAsia="Times New Roman" w:hAnsi="Times New Roman" w:cs="Times New Roman"/>
+          <w:sz w:val="24"/>
+          <w:szCs w:val="24"/>
+        </w:rPr>
+      </w:pPr>
+      <w:r>
+        <w:rPr>
+          <w:rFonts w:ascii="Times New Roman" w:eastAsia="Times New Roman" w:hAnsi="Times New Roman" w:cs="Times New Roman"/>
+          <w:b/>
+          <w:bCs/>
+          <w:sz w:val="24"/>
+          <w:szCs w:val="24"/>
+        </w:rPr>
+        <w:t xml:space="preserve">NOTE: </w:t>
+      </w:r>
+      <w:r>
+        <w:rPr>
+          <w:rFonts w:ascii="Times New Roman" w:eastAsia="Times New Roman" w:hAnsi="Times New Roman" w:cs="Times New Roman"/>
+          <w:sz w:val="24"/>
+          <w:szCs w:val="24"/>
+        </w:rPr>
+        <w:t xml:space="preserve">A lot of communication occurred over Discord!!!! </w:t>
+      </w:r>
     </w:p>
     <w:sectPr>
       <w:pgSz w:w="12240" w:h="15840"/>

</xml_diff>